<commit_message>
Add missing </Document> close tag for CP4807-CPDcert block - fixes nested block tagging error
Co-Authored-By: Claude Sonnet 4.6 <noreply@anthropic.com>
</commit_message>
<xml_diff>
--- a/document-splitter/source/CP4807 - Introduction to microcontrollers 05 04 26.docx
+++ b/document-splitter/source/CP4807 - Introduction to microcontrollers 05 04 26.docx
@@ -7,13 +7,13 @@
         <w:pStyle w:val="Wsreference"/>
       </w:pPr>
       <w:r>
-        <w:t>&lt;HTML&gt; &lt;</w:t>
+        <w:t>&lt;</w:t>
       </w:r>
       <w:r>
         <w:t>worksheet</w:t>
       </w:r>
       <w:r>
-        <w:t>&gt; “</w:t>
+        <w:t>&gt; &lt;filename&gt; “</w:t>
       </w:r>
       <w:r>
         <w:t>CP4807-</w:t>
@@ -766,7 +766,7 @@
               <w:t>&lt;worksheet&gt; &lt;filename&gt; “</w:t>
             </w:r>
             <w:r>
-              <w:t>CP4807-1</w:t>
+              <w:t>CP4807-0</w:t>
             </w:r>
             <w:r>
               <w:t>.doc” &lt;/filename&gt;</w:t>
@@ -12360,6 +12360,14 @@
       <w:pPr>
         <w:pStyle w:val="Wsreference"/>
       </w:pPr>
+      <w:r>
+        <w:t>&lt;/Document&gt;</w:t>
+      </w:r>
+    </w:p>
+    <w:p>
+      <w:pPr>
+        <w:pStyle w:val="Wsreference"/>
+      </w:pPr>
     </w:p>
     <w:p>
       <w:pPr>
@@ -22126,7 +22134,7 @@
         <w:ind w:left="720" w:firstLine="720"/>
       </w:pPr>
       <w:r>
-        <w:t>Content between “&lt;HTML&gt;” and “&lt;/HTML&gt;”: make me an HTML file</w:t>
+        <w:t>Content between “[HTML]” and “[/HTML]”: make me an HTML file</w:t>
       </w:r>
       <w:r>
         <w:t xml:space="preserve"> from the content between these tags</w:t>
@@ -22138,7 +22146,7 @@
         <w:ind w:left="720" w:firstLine="720"/>
       </w:pPr>
       <w:r>
-        <w:t>Content between “&lt;worksheet&gt;” and “&lt;/worksheet&gt;”: make me a Word file</w:t>
+        <w:t>Content between “[worksheet]” and “[/worksheet]”: make me a Word file</w:t>
       </w:r>
       <w:r>
         <w:t xml:space="preserve"> </w:t>
@@ -22153,7 +22161,7 @@
         <w:ind w:left="720" w:firstLine="720"/>
       </w:pPr>
       <w:r>
-        <w:t>Content between “&lt;document&gt;” and “&lt;/document&gt;”: make me a Word file</w:t>
+        <w:t>Content between “[document]” and “[/document]”: make me a Word file</w:t>
       </w:r>
       <w:r>
         <w:t xml:space="preserve"> </w:t>
@@ -22210,13 +22218,13 @@
         <w:ind w:firstLine="720"/>
       </w:pPr>
       <w:r>
-        <w:t>&lt;filename&gt; “</w:t>
+        <w:t>“</w:t>
       </w:r>
       <w:r>
         <w:t>CP4807-</w:t>
       </w:r>
       <w:r>
-        <w:t xml:space="preserve"> worksheets.pdf” &lt;/filename&gt; </w:t>
+        <w:t xml:space="preserve"> worksheets.pdf”</w:t>
       </w:r>
     </w:p>
     <w:p>
@@ -29592,13 +29600,13 @@
       </w:r>
       <w:proofErr w:type="gramEnd"/>
       <w:r>
-        <w:t xml:space="preserve"> please print them a certificate of completion using &lt;filename&gt; “</w:t>
+        <w:t xml:space="preserve"> please print them a certificate of completion using “</w:t>
       </w:r>
       <w:r>
         <w:t>CP4807-</w:t>
       </w:r>
       <w:r>
-        <w:t>CPDcert.docx” &lt;/filename&gt;</w:t>
+        <w:t>CPDcert.docx”</w:t>
       </w:r>
     </w:p>
     <w:p>

</xml_diff>